<commit_message>
i changes the barcode for the website
</commit_message>
<xml_diff>
--- a/server/utility/WSE invoice.docx
+++ b/server/utility/WSE invoice.docx
@@ -263,6 +263,482 @@
           <w:lang w:val="en-US"/>
         </w:rPr>
       </w:pPr>
+      <w:proofErr w:type="spellStart"/>
+      <w:proofErr w:type="gramStart"/>
+      <w:r>
+        <w:rPr>
+          <w:lang w:val="en-US"/>
+        </w:rPr>
+        <w:t>Sno</w:t>
+      </w:r>
+      <w:proofErr w:type="spellEnd"/>
+      <w:r>
+        <w:rPr>
+          <w:lang w:val="en-US"/>
+        </w:rPr>
+        <w:t>:{</w:t>
+      </w:r>
+      <w:proofErr w:type="gramEnd"/>
+      <w:r>
+        <w:rPr>
+          <w:lang w:val="en-US"/>
+        </w:rPr>
+        <w:t xml:space="preserve">{ </w:t>
+      </w:r>
+      <w:proofErr w:type="spellStart"/>
+      <w:r>
+        <w:rPr>
+          <w:lang w:val="en-US"/>
+        </w:rPr>
+        <w:t>sno</w:t>
+      </w:r>
+      <w:proofErr w:type="spellEnd"/>
+      <w:r>
+        <w:rPr>
+          <w:lang w:val="en-US"/>
+        </w:rPr>
+        <w:t>}}</w:t>
+      </w:r>
+      <w:r>
+        <w:rPr>
+          <w:lang w:val="en-US"/>
+        </w:rPr>
+        <w:t xml:space="preserve"> </w:t>
+      </w:r>
+      <w:r>
+        <w:rPr>
+          <w:lang w:val="en-US"/>
+        </w:rPr>
+        <w:t>Date:{{</w:t>
+      </w:r>
+      <w:proofErr w:type="spellStart"/>
+      <w:r>
+        <w:rPr>
+          <w:lang w:val="en-US"/>
+        </w:rPr>
+        <w:t>time_now</w:t>
+      </w:r>
+      <w:proofErr w:type="spellEnd"/>
+      <w:r>
+        <w:rPr>
+          <w:lang w:val="en-US"/>
+        </w:rPr>
+        <w:t>}}</w:t>
+      </w:r>
+    </w:p>
+    <w:p>
+      <w:pPr>
+        <w:spacing w:after="0"/>
+        <w:ind w:right="226"/>
+        <w:rPr>
+          <w:lang w:val="en-US"/>
+        </w:rPr>
+      </w:pPr>
+      <w:proofErr w:type="gramStart"/>
+      <w:r>
+        <w:rPr>
+          <w:lang w:val="en-US"/>
+        </w:rPr>
+        <w:t>Name:{</w:t>
+      </w:r>
+      <w:proofErr w:type="gramEnd"/>
+      <w:r>
+        <w:rPr>
+          <w:lang w:val="en-US"/>
+        </w:rPr>
+        <w:t>{name}}</w:t>
+      </w:r>
+    </w:p>
+    <w:p>
+      <w:pPr>
+        <w:spacing w:after="0"/>
+        <w:ind w:right="367"/>
+        <w:rPr>
+          <w:lang w:val="en-US"/>
+        </w:rPr>
+      </w:pPr>
+      <w:proofErr w:type="gramStart"/>
+      <w:r>
+        <w:rPr>
+          <w:lang w:val="en-US"/>
+        </w:rPr>
+        <w:t>Contact:{</w:t>
+      </w:r>
+      <w:proofErr w:type="gramEnd"/>
+      <w:r>
+        <w:rPr>
+          <w:lang w:val="en-US"/>
+        </w:rPr>
+        <w:t>{contact}}</w:t>
+      </w:r>
+    </w:p>
+    <w:tbl>
+      <w:tblPr>
+        <w:tblStyle w:val="TableGrid"/>
+        <w:tblW w:w="3600" w:type="dxa"/>
+        <w:tblInd w:w="-5" w:type="dxa"/>
+        <w:tblLayout w:type="fixed"/>
+        <w:tblLook w:val="04A0" w:firstRow="1" w:lastRow="0" w:firstColumn="1" w:lastColumn="0" w:noHBand="0" w:noVBand="1"/>
+      </w:tblPr>
+      <w:tblGrid>
+        <w:gridCol w:w="1980"/>
+        <w:gridCol w:w="616"/>
+        <w:gridCol w:w="14"/>
+        <w:gridCol w:w="957"/>
+        <w:gridCol w:w="33"/>
+      </w:tblGrid>
+      <w:tr>
+        <w:trPr>
+          <w:trHeight w:val="248"/>
+        </w:trPr>
+        <w:tc>
+          <w:tcPr>
+            <w:tcW w:w="1980" w:type="dxa"/>
+            <w:shd w:val="clear" w:color="auto" w:fill="000000" w:themeFill="text1"/>
+          </w:tcPr>
+          <w:p>
+            <w:pPr>
+              <w:ind w:left="-90"/>
+              <w:rPr>
+                <w:color w:val="FFFFFF" w:themeColor="background1"/>
+                <w:lang w:val="en-US"/>
+              </w:rPr>
+            </w:pPr>
+            <w:r>
+              <w:rPr>
+                <w:color w:val="FFFFFF" w:themeColor="background1"/>
+                <w:lang w:val="en-US"/>
+              </w:rPr>
+              <w:t>Description</w:t>
+            </w:r>
+          </w:p>
+        </w:tc>
+        <w:tc>
+          <w:tcPr>
+            <w:tcW w:w="630" w:type="dxa"/>
+            <w:gridSpan w:val="2"/>
+            <w:shd w:val="clear" w:color="auto" w:fill="000000" w:themeFill="text1"/>
+          </w:tcPr>
+          <w:p>
+            <w:pPr>
+              <w:ind w:left="-90"/>
+              <w:rPr>
+                <w:color w:val="FFFFFF" w:themeColor="background1"/>
+                <w:lang w:val="en-US"/>
+              </w:rPr>
+            </w:pPr>
+            <w:r>
+              <w:rPr>
+                <w:color w:val="FFFFFF" w:themeColor="background1"/>
+                <w:lang w:val="en-US"/>
+              </w:rPr>
+              <w:t>Rate</w:t>
+            </w:r>
+          </w:p>
+        </w:tc>
+        <w:tc>
+          <w:tcPr>
+            <w:tcW w:w="990" w:type="dxa"/>
+            <w:gridSpan w:val="2"/>
+            <w:shd w:val="clear" w:color="auto" w:fill="000000" w:themeFill="text1"/>
+          </w:tcPr>
+          <w:p>
+            <w:pPr>
+              <w:ind w:left="-90" w:right="62"/>
+              <w:rPr>
+                <w:color w:val="FFFFFF" w:themeColor="background1"/>
+                <w:lang w:val="en-US"/>
+              </w:rPr>
+            </w:pPr>
+            <w:r>
+              <w:rPr>
+                <w:color w:val="FFFFFF" w:themeColor="background1"/>
+                <w:lang w:val="en-US"/>
+              </w:rPr>
+              <w:t>Amount</w:t>
+            </w:r>
+          </w:p>
+        </w:tc>
+      </w:tr>
+      <w:tr>
+        <w:trPr>
+          <w:trHeight w:val="681"/>
+        </w:trPr>
+        <w:tc>
+          <w:tcPr>
+            <w:tcW w:w="1980" w:type="dxa"/>
+          </w:tcPr>
+          <w:p>
+            <w:pPr>
+              <w:ind w:left="-90"/>
+              <w:rPr>
+                <w:lang w:val="en-US"/>
+              </w:rPr>
+            </w:pPr>
+            <w:r>
+              <w:rPr>
+                <w:lang w:val="en-US"/>
+              </w:rPr>
+              <w:t>{{qt</w:t>
+            </w:r>
+            <w:proofErr w:type="gramStart"/>
+            <w:r>
+              <w:rPr>
+                <w:lang w:val="en-US"/>
+              </w:rPr>
+              <w:t>}}</w:t>
+            </w:r>
+            <w:r>
+              <w:rPr>
+                <w:lang w:val="en-US"/>
+              </w:rPr>
+              <w:t>{</w:t>
+            </w:r>
+            <w:proofErr w:type="gramEnd"/>
+            <w:r>
+              <w:rPr>
+                <w:lang w:val="en-US"/>
+              </w:rPr>
+              <w:t>{description}}</w:t>
+            </w:r>
+          </w:p>
+        </w:tc>
+        <w:tc>
+          <w:tcPr>
+            <w:tcW w:w="630" w:type="dxa"/>
+            <w:gridSpan w:val="2"/>
+          </w:tcPr>
+          <w:p>
+            <w:pPr>
+              <w:ind w:left="-90"/>
+              <w:rPr>
+                <w:lang w:val="en-US"/>
+              </w:rPr>
+            </w:pPr>
+            <w:r>
+              <w:rPr>
+                <w:lang w:val="en-US"/>
+              </w:rPr>
+              <w:t>{{r}}</w:t>
+            </w:r>
+          </w:p>
+        </w:tc>
+        <w:tc>
+          <w:tcPr>
+            <w:tcW w:w="990" w:type="dxa"/>
+            <w:gridSpan w:val="2"/>
+          </w:tcPr>
+          <w:p>
+            <w:pPr>
+              <w:ind w:left="-90"/>
+              <w:rPr>
+                <w:lang w:val="en-US"/>
+              </w:rPr>
+            </w:pPr>
+            <w:r>
+              <w:rPr>
+                <w:lang w:val="en-US"/>
+              </w:rPr>
+              <w:t>{{amt}}</w:t>
+            </w:r>
+          </w:p>
+        </w:tc>
+      </w:tr>
+      <w:tr>
+        <w:trPr>
+          <w:gridAfter w:val="1"/>
+          <w:wAfter w:w="33" w:type="dxa"/>
+          <w:trHeight w:val="248"/>
+        </w:trPr>
+        <w:tc>
+          <w:tcPr>
+            <w:tcW w:w="2596" w:type="dxa"/>
+            <w:gridSpan w:val="2"/>
+          </w:tcPr>
+          <w:p>
+            <w:pPr>
+              <w:ind w:left="-90"/>
+              <w:rPr>
+                <w:lang w:val="en-US"/>
+              </w:rPr>
+            </w:pPr>
+            <w:r>
+              <w:rPr>
+                <w:lang w:val="en-US"/>
+              </w:rPr>
+              <w:t>Total Amount</w:t>
+            </w:r>
+          </w:p>
+        </w:tc>
+        <w:tc>
+          <w:tcPr>
+            <w:tcW w:w="971" w:type="dxa"/>
+            <w:gridSpan w:val="2"/>
+          </w:tcPr>
+          <w:p>
+            <w:pPr>
+              <w:ind w:left="-90"/>
+              <w:rPr>
+                <w:lang w:val="en-US"/>
+              </w:rPr>
+            </w:pPr>
+            <w:r>
+              <w:rPr>
+                <w:lang w:val="en-US"/>
+              </w:rPr>
+              <w:t>{{</w:t>
+            </w:r>
+            <w:proofErr w:type="spellStart"/>
+            <w:r>
+              <w:rPr>
+                <w:lang w:val="en-US"/>
+              </w:rPr>
+              <w:t>t_amt</w:t>
+            </w:r>
+            <w:proofErr w:type="spellEnd"/>
+            <w:r>
+              <w:rPr>
+                <w:lang w:val="en-US"/>
+              </w:rPr>
+              <w:t>}}</w:t>
+            </w:r>
+          </w:p>
+        </w:tc>
+      </w:tr>
+      <w:tr>
+        <w:trPr>
+          <w:gridAfter w:val="1"/>
+          <w:wAfter w:w="33" w:type="dxa"/>
+          <w:trHeight w:val="248"/>
+        </w:trPr>
+        <w:tc>
+          <w:tcPr>
+            <w:tcW w:w="2596" w:type="dxa"/>
+            <w:gridSpan w:val="2"/>
+          </w:tcPr>
+          <w:p>
+            <w:pPr>
+              <w:ind w:left="-90"/>
+              <w:rPr>
+                <w:lang w:val="en-US"/>
+              </w:rPr>
+            </w:pPr>
+            <w:r>
+              <w:rPr>
+                <w:lang w:val="en-US"/>
+              </w:rPr>
+              <w:t>Discount</w:t>
+            </w:r>
+          </w:p>
+        </w:tc>
+        <w:tc>
+          <w:tcPr>
+            <w:tcW w:w="971" w:type="dxa"/>
+            <w:gridSpan w:val="2"/>
+          </w:tcPr>
+          <w:p>
+            <w:pPr>
+              <w:ind w:left="-90"/>
+              <w:rPr>
+                <w:lang w:val="en-US"/>
+              </w:rPr>
+            </w:pPr>
+            <w:r>
+              <w:rPr>
+                <w:lang w:val="en-US"/>
+              </w:rPr>
+              <w:t>{{</w:t>
+            </w:r>
+            <w:proofErr w:type="spellStart"/>
+            <w:r>
+              <w:rPr>
+                <w:lang w:val="en-US"/>
+              </w:rPr>
+              <w:t>d_amt</w:t>
+            </w:r>
+            <w:proofErr w:type="spellEnd"/>
+            <w:r>
+              <w:rPr>
+                <w:lang w:val="en-US"/>
+              </w:rPr>
+              <w:t>}}</w:t>
+            </w:r>
+          </w:p>
+        </w:tc>
+        <w:bookmarkStart w:id="0" w:name="_GoBack"/>
+        <w:bookmarkEnd w:id="0"/>
+      </w:tr>
+      <w:tr>
+        <w:trPr>
+          <w:gridAfter w:val="1"/>
+          <w:wAfter w:w="33" w:type="dxa"/>
+          <w:trHeight w:val="248"/>
+        </w:trPr>
+        <w:tc>
+          <w:tcPr>
+            <w:tcW w:w="2596" w:type="dxa"/>
+            <w:gridSpan w:val="2"/>
+          </w:tcPr>
+          <w:p>
+            <w:pPr>
+              <w:ind w:left="-90"/>
+              <w:rPr>
+                <w:lang w:val="en-US"/>
+              </w:rPr>
+            </w:pPr>
+            <w:r>
+              <w:rPr>
+                <w:lang w:val="en-US"/>
+              </w:rPr>
+              <w:t>Balance</w:t>
+            </w:r>
+          </w:p>
+        </w:tc>
+        <w:tc>
+          <w:tcPr>
+            <w:tcW w:w="971" w:type="dxa"/>
+            <w:gridSpan w:val="2"/>
+          </w:tcPr>
+          <w:p>
+            <w:pPr>
+              <w:ind w:left="-90"/>
+              <w:rPr>
+                <w:lang w:val="en-US"/>
+              </w:rPr>
+            </w:pPr>
+            <w:r>
+              <w:rPr>
+                <w:lang w:val="en-US"/>
+              </w:rPr>
+              <w:t>{{</w:t>
+            </w:r>
+            <w:proofErr w:type="spellStart"/>
+            <w:r>
+              <w:rPr>
+                <w:lang w:val="en-US"/>
+              </w:rPr>
+              <w:t>b_amt</w:t>
+            </w:r>
+            <w:proofErr w:type="spellEnd"/>
+            <w:r>
+              <w:rPr>
+                <w:lang w:val="en-US"/>
+              </w:rPr>
+              <w:t>}}</w:t>
+            </w:r>
+          </w:p>
+        </w:tc>
+      </w:tr>
+    </w:tbl>
+    <w:p>
+      <w:pPr>
+        <w:spacing w:after="0"/>
+        <w:ind w:left="-90" w:right="9"/>
+        <w:jc w:val="center"/>
+        <w:rPr>
+          <w:lang w:val="en-US"/>
+        </w:rPr>
+      </w:pPr>
       <w:r>
         <w:rPr>
           <w:noProof/>
@@ -271,18 +747,18 @@
         <mc:AlternateContent>
           <mc:Choice Requires="wps">
             <w:drawing>
-              <wp:anchor distT="0" distB="0" distL="114300" distR="114300" simplePos="0" relativeHeight="251661312" behindDoc="0" locked="0" layoutInCell="1" allowOverlap="1">
+              <wp:anchor distT="0" distB="0" distL="114300" distR="114300" simplePos="0" relativeHeight="251660288" behindDoc="0" locked="0" layoutInCell="1" allowOverlap="1">
                 <wp:simplePos x="0" y="0"/>
-                <wp:positionH relativeFrom="column">
-                  <wp:posOffset>1244600</wp:posOffset>
+                <wp:positionH relativeFrom="margin">
+                  <wp:posOffset>116417</wp:posOffset>
                 </wp:positionH>
                 <wp:positionV relativeFrom="paragraph">
-                  <wp:posOffset>22225</wp:posOffset>
+                  <wp:posOffset>176107</wp:posOffset>
                 </wp:positionV>
-                <wp:extent cx="971550" cy="866775"/>
-                <wp:effectExtent l="0" t="0" r="0" b="9525"/>
+                <wp:extent cx="2009955" cy="1371600"/>
+                <wp:effectExtent l="0" t="0" r="28575" b="19050"/>
                 <wp:wrapNone/>
-                <wp:docPr id="6" name="Rectangle 6"/>
+                <wp:docPr id="2" name="Rectangle 2"/>
                 <wp:cNvGraphicFramePr/>
                 <a:graphic xmlns:a="http://schemas.openxmlformats.org/drawingml/2006/main">
                   <a:graphicData uri="http://schemas.microsoft.com/office/word/2010/wordprocessingShape">
@@ -291,13 +767,15 @@
                       <wps:spPr>
                         <a:xfrm>
                           <a:off x="0" y="0"/>
-                          <a:ext cx="971550" cy="866775"/>
+                          <a:ext cx="2009955" cy="1371600"/>
                         </a:xfrm>
                         <a:prstGeom prst="rect">
                           <a:avLst/>
                         </a:prstGeom>
                         <a:ln>
-                          <a:noFill/>
+                          <a:solidFill>
+                            <a:schemeClr val="tx1"/>
+                          </a:solidFill>
                         </a:ln>
                       </wps:spPr>
                       <wps:style>
@@ -318,17 +796,90 @@
                         <w:txbxContent>
                           <w:p>
                             <w:pPr>
+                              <w:spacing w:after="0"/>
                               <w:jc w:val="center"/>
+                              <w:rPr>
+                                <w:i/>
+                                <w:iCs/>
+                                <w:lang w:val="en-US"/>
+                              </w:rPr>
                             </w:pPr>
                             <w:r>
                               <w:rPr>
+                                <w:i/>
+                                <w:iCs/>
+                                <w:lang w:val="en-US"/>
+                              </w:rPr>
+                              <w:t xml:space="preserve">    </w:t>
+                            </w:r>
+                            <w:r>
+                              <w:rPr>
+                                <w:i/>
+                                <w:iCs/>
+                                <w:lang w:val="en-US"/>
+                              </w:rPr>
+                              <w:t>Developed by</w:t>
+                            </w:r>
+                          </w:p>
+                          <w:p>
+                            <w:pPr>
+                              <w:spacing w:after="0"/>
+                              <w:jc w:val="center"/>
+                              <w:rPr>
+                                <w:i/>
+                                <w:iCs/>
+                                <w:lang w:val="en-US"/>
+                              </w:rPr>
+                            </w:pPr>
+                            <w:r>
+                              <w:rPr>
+                                <w:i/>
+                                <w:iCs/>
+                                <w:lang w:val="en-US"/>
+                              </w:rPr>
+                              <w:t>WAHEEDSONS</w:t>
+                            </w:r>
+                            <w:r>
+                              <w:rPr>
+                                <w:i/>
+                                <w:iCs/>
+                                <w:lang w:val="en-US"/>
+                              </w:rPr>
+                              <w:t xml:space="preserve"> </w:t>
+                            </w:r>
+                            <w:r>
+                              <w:rPr>
+                                <w:i/>
+                                <w:iCs/>
+                                <w:lang w:val="en-US"/>
+                              </w:rPr>
+                              <w:t>ENGINEERING</w:t>
+                            </w:r>
+                            <w:r>
+                              <w:rPr>
+                                <w:b/>
+                                <w:bCs/>
+                                <w:i/>
+                                <w:iCs/>
                                 <w:noProof/>
+                                <w:lang w:val="en-US"/>
+                              </w:rPr>
+                              <w:t xml:space="preserve">     </w:t>
+                            </w:r>
+                            <w:r>
+                              <w:rPr>
+                                <w:b/>
+                                <w:bCs/>
+                                <w:i/>
+                                <w:iCs/>
+                                <w:noProof/>
+                                <w:lang w:val="en-US"/>
                               </w:rPr>
                               <w:drawing>
-                                <wp:inline distT="0" distB="0" distL="0" distR="0" wp14:anchorId="5BD4D1C5" wp14:editId="0E805314">
-                                  <wp:extent cx="828675" cy="771525"/>
-                                  <wp:effectExtent l="0" t="0" r="9525" b="9525"/>
-                                  <wp:docPr id="8" name="Graphic 8"/>
+                                <wp:inline distT="0" distB="0" distL="0" distR="0">
+                                  <wp:extent cx="956733" cy="894715"/>
+                                  <wp:effectExtent l="0" t="0" r="0" b="635"/>
+                                  <wp:docPr id="4" name="Picture 4"/>
                                   <wp:cNvGraphicFramePr>
                                     <a:graphicFrameLocks xmlns:a="http://schemas.openxmlformats.org/drawingml/2006/main" noChangeAspect="1"/>
                                   </wp:cNvGraphicFramePr>
@@ -336,7 +887,7 @@
                                     <a:graphicData uri="http://schemas.openxmlformats.org/drawingml/2006/picture">
                                       <pic:pic xmlns:pic="http://schemas.openxmlformats.org/drawingml/2006/picture">
                                         <pic:nvPicPr>
-                                          <pic:cNvPr id="8" name="qr-code.svg"/>
+                                          <pic:cNvPr id="4" name="website.png"/>
                                           <pic:cNvPicPr/>
                                         </pic:nvPicPr>
                                         <pic:blipFill>
@@ -344,9 +895,6 @@
                                             <a:extLst>
                                               <a:ext uri="{28A0092B-C50C-407E-A947-70E740481C1C}">
                                                 <a14:useLocalDpi xmlns:a14="http://schemas.microsoft.com/office/drawing/2010/main" val="0"/>
-                                              </a:ext>
-                                              <a:ext uri="{96DAC541-7B7A-43D3-8B79-37D633B846F1}">
-                                                <asvg:svgBlip xmlns:asvg="http://schemas.microsoft.com/office/drawing/2016/SVG/main" r:embed="rId10"/>
                                               </a:ext>
                                             </a:extLst>
                                           </a:blip>
@@ -357,7 +905,7 @@
                                         <pic:spPr>
                                           <a:xfrm>
                                             <a:off x="0" y="0"/>
-                                            <a:ext cx="828675" cy="771525"/>
+                                            <a:ext cx="958857" cy="896701"/>
                                           </a:xfrm>
                                           <a:prstGeom prst="rect">
                                             <a:avLst/>
@@ -369,6 +917,24 @@
                                 </wp:inline>
                               </w:drawing>
                             </w:r>
+                          </w:p>
+                          <w:p>
+                            <w:pPr>
+                              <w:spacing w:after="0"/>
+                              <w:jc w:val="center"/>
+                              <w:rPr>
+                                <w:b/>
+                                <w:bCs/>
+                                <w:u w:val="single"/>
+                                <w:lang w:val="en-US"/>
+                              </w:rPr>
+                            </w:pPr>
+                          </w:p>
+                          <w:p>
+                            <w:pPr>
+                              <w:spacing w:after="0"/>
+                              <w:jc w:val="center"/>
+                            </w:pPr>
                           </w:p>
                         </w:txbxContent>
                       </wps:txbx>
@@ -392,22 +958,95 @@
           </mc:Choice>
           <mc:Fallback>
             <w:pict>
-              <v:rect id="Rectangle 6" o:spid="_x0000_s1027" style="position:absolute;margin-left:98pt;margin-top:1.75pt;width:76.5pt;height:68.25pt;z-index:251661312;visibility:visible;mso-wrap-style:square;mso-width-percent:0;mso-height-percent:0;mso-wrap-distance-left:9pt;mso-wrap-distance-top:0;mso-wrap-distance-right:9pt;mso-wrap-distance-bottom:0;mso-position-horizontal:absolute;mso-position-horizontal-relative:text;mso-position-vertical:absolute;mso-position-vertical-relative:text;mso-width-percent:0;mso-height-percent:0;mso-width-relative:margin;mso-height-relative:margin;v-text-anchor:middle" o:gfxdata="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" fillcolor="white [3201]" stroked="f" strokeweight="1pt">
+              <v:rect id="Rectangle 2" o:spid="_x0000_s1027" style="position:absolute;left:0;text-align:left;margin-left:9.15pt;margin-top:13.85pt;width:158.25pt;height:108pt;z-index:251660288;visibility:visible;mso-wrap-style:square;mso-width-percent:0;mso-height-percent:0;mso-wrap-distance-left:9pt;mso-wrap-distance-top:0;mso-wrap-distance-right:9pt;mso-wrap-distance-bottom:0;mso-position-horizontal:absolute;mso-position-horizontal-relative:margin;mso-position-vertical:absolute;mso-position-vertical-relative:text;mso-width-percent:0;mso-height-percent:0;mso-width-relative:margin;mso-height-relative:margin;v-text-anchor:middle" o:gfxdata="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" fillcolor="white [3201]" strokecolor="black [3213]" strokeweight="1pt">
                 <v:textbox>
                   <w:txbxContent>
                     <w:p>
                       <w:pPr>
+                        <w:spacing w:after="0"/>
                         <w:jc w:val="center"/>
+                        <w:rPr>
+                          <w:i/>
+                          <w:iCs/>
+                          <w:lang w:val="en-US"/>
+                        </w:rPr>
                       </w:pPr>
                       <w:r>
                         <w:rPr>
+                          <w:i/>
+                          <w:iCs/>
+                          <w:lang w:val="en-US"/>
+                        </w:rPr>
+                        <w:t xml:space="preserve">    </w:t>
+                      </w:r>
+                      <w:r>
+                        <w:rPr>
+                          <w:i/>
+                          <w:iCs/>
+                          <w:lang w:val="en-US"/>
+                        </w:rPr>
+                        <w:t>Developed by</w:t>
+                      </w:r>
+                    </w:p>
+                    <w:p>
+                      <w:pPr>
+                        <w:spacing w:after="0"/>
+                        <w:jc w:val="center"/>
+                        <w:rPr>
+                          <w:i/>
+                          <w:iCs/>
+                          <w:lang w:val="en-US"/>
+                        </w:rPr>
+                      </w:pPr>
+                      <w:r>
+                        <w:rPr>
+                          <w:i/>
+                          <w:iCs/>
+                          <w:lang w:val="en-US"/>
+                        </w:rPr>
+                        <w:t>WAHEEDSONS</w:t>
+                      </w:r>
+                      <w:r>
+                        <w:rPr>
+                          <w:i/>
+                          <w:iCs/>
+                          <w:lang w:val="en-US"/>
+                        </w:rPr>
+                        <w:t xml:space="preserve"> </w:t>
+                      </w:r>
+                      <w:r>
+                        <w:rPr>
+                          <w:i/>
+                          <w:iCs/>
+                          <w:lang w:val="en-US"/>
+                        </w:rPr>
+                        <w:t>ENGINEERING</w:t>
+                      </w:r>
+                      <w:r>
+                        <w:rPr>
+                          <w:b/>
+                          <w:bCs/>
+                          <w:i/>
+                          <w:iCs/>
                           <w:noProof/>
+                          <w:lang w:val="en-US"/>
+                        </w:rPr>
+                        <w:t xml:space="preserve">     </w:t>
+                      </w:r>
+                      <w:r>
+                        <w:rPr>
+                          <w:b/>
+                          <w:bCs/>
+                          <w:i/>
+                          <w:iCs/>
+                          <w:noProof/>
+                          <w:lang w:val="en-US"/>
                         </w:rPr>
                         <w:drawing>
-                          <wp:inline distT="0" distB="0" distL="0" distR="0" wp14:anchorId="5BD4D1C5" wp14:editId="0E805314">
-                            <wp:extent cx="828675" cy="771525"/>
-                            <wp:effectExtent l="0" t="0" r="9525" b="9525"/>
-                            <wp:docPr id="8" name="Graphic 8"/>
+                          <wp:inline distT="0" distB="0" distL="0" distR="0">
+                            <wp:extent cx="956733" cy="894715"/>
+                            <wp:effectExtent l="0" t="0" r="0" b="635"/>
+                            <wp:docPr id="4" name="Picture 4"/>
                             <wp:cNvGraphicFramePr>
                               <a:graphicFrameLocks xmlns:a="http://schemas.openxmlformats.org/drawingml/2006/main" noChangeAspect="1"/>
                             </wp:cNvGraphicFramePr>
@@ -415,7 +1054,7 @@
                               <a:graphicData uri="http://schemas.openxmlformats.org/drawingml/2006/picture">
                                 <pic:pic xmlns:pic="http://schemas.openxmlformats.org/drawingml/2006/picture">
                                   <pic:nvPicPr>
-                                    <pic:cNvPr id="8" name="qr-code.svg"/>
+                                    <pic:cNvPr id="4" name="website.png"/>
                                     <pic:cNvPicPr/>
                                   </pic:nvPicPr>
                                   <pic:blipFill>
@@ -423,9 +1062,6 @@
                                       <a:extLst>
                                         <a:ext uri="{28A0092B-C50C-407E-A947-70E740481C1C}">
                                           <a14:useLocalDpi xmlns:a14="http://schemas.microsoft.com/office/drawing/2010/main" val="0"/>
-                                        </a:ext>
-                                        <a:ext uri="{96DAC541-7B7A-43D3-8B79-37D633B846F1}">
-                                          <asvg:svgBlip xmlns:asvg="http://schemas.microsoft.com/office/drawing/2016/SVG/main" r:embed="rId10"/>
                                         </a:ext>
                                       </a:extLst>
                                     </a:blip>
@@ -436,7 +1072,7 @@
                                   <pic:spPr>
                                     <a:xfrm>
                                       <a:off x="0" y="0"/>
-                                      <a:ext cx="828675" cy="771525"/>
+                                      <a:ext cx="958857" cy="896701"/>
                                     </a:xfrm>
                                     <a:prstGeom prst="rect">
                                       <a:avLst/>
@@ -449,684 +1085,9 @@
                         </w:drawing>
                       </w:r>
                     </w:p>
-                  </w:txbxContent>
-                </v:textbox>
-              </v:rect>
-            </w:pict>
-          </mc:Fallback>
-        </mc:AlternateContent>
-      </w:r>
-      <w:proofErr w:type="spellStart"/>
-      <w:r>
-        <w:rPr>
-          <w:lang w:val="en-US"/>
-        </w:rPr>
-        <w:t>Sno</w:t>
-      </w:r>
-      <w:proofErr w:type="spellEnd"/>
-      <w:r>
-        <w:rPr>
-          <w:lang w:val="en-US"/>
-        </w:rPr>
-        <w:t xml:space="preserve">:    </w:t>
-      </w:r>
-      <w:proofErr w:type="gramStart"/>
-      <w:r>
-        <w:rPr>
-          <w:lang w:val="en-US"/>
-        </w:rPr>
-        <w:t xml:space="preserve">   {</w:t>
-      </w:r>
-      <w:proofErr w:type="gramEnd"/>
-      <w:r>
-        <w:rPr>
-          <w:lang w:val="en-US"/>
-        </w:rPr>
-        <w:t xml:space="preserve">{ </w:t>
-      </w:r>
-      <w:proofErr w:type="spellStart"/>
-      <w:r>
-        <w:rPr>
-          <w:lang w:val="en-US"/>
-        </w:rPr>
-        <w:t>sno</w:t>
-      </w:r>
-      <w:proofErr w:type="spellEnd"/>
-      <w:r>
-        <w:rPr>
-          <w:lang w:val="en-US"/>
-        </w:rPr>
-        <w:t>}}</w:t>
-      </w:r>
-    </w:p>
-    <w:p>
-      <w:pPr>
-        <w:spacing w:after="0"/>
-        <w:ind w:right="226"/>
-        <w:rPr>
-          <w:lang w:val="en-US"/>
-        </w:rPr>
-      </w:pPr>
-      <w:r>
-        <w:rPr>
-          <w:lang w:val="en-US"/>
-        </w:rPr>
-        <w:t xml:space="preserve">Date:  </w:t>
-      </w:r>
-      <w:proofErr w:type="gramStart"/>
-      <w:r>
-        <w:rPr>
-          <w:lang w:val="en-US"/>
-        </w:rPr>
-        <w:t xml:space="preserve">   {</w:t>
-      </w:r>
-      <w:proofErr w:type="gramEnd"/>
-      <w:r>
-        <w:rPr>
-          <w:lang w:val="en-US"/>
-        </w:rPr>
-        <w:t>{</w:t>
-      </w:r>
-      <w:proofErr w:type="spellStart"/>
-      <w:r>
-        <w:rPr>
-          <w:lang w:val="en-US"/>
-        </w:rPr>
-        <w:t>time_now</w:t>
-      </w:r>
-      <w:proofErr w:type="spellEnd"/>
-      <w:r>
-        <w:rPr>
-          <w:lang w:val="en-US"/>
-        </w:rPr>
-        <w:t>}}</w:t>
-      </w:r>
-    </w:p>
-    <w:p>
-      <w:pPr>
-        <w:spacing w:after="0"/>
-        <w:ind w:right="226"/>
-        <w:rPr>
-          <w:lang w:val="en-US"/>
-        </w:rPr>
-      </w:pPr>
-      <w:r>
-        <w:rPr>
-          <w:lang w:val="en-US"/>
-        </w:rPr>
-        <w:t>Name:</w:t>
-      </w:r>
-      <w:proofErr w:type="gramStart"/>
-      <w:r>
-        <w:rPr>
-          <w:lang w:val="en-US"/>
-        </w:rPr>
-        <w:t xml:space="preserve">   {</w:t>
-      </w:r>
-      <w:proofErr w:type="gramEnd"/>
-      <w:r>
-        <w:rPr>
-          <w:lang w:val="en-US"/>
-        </w:rPr>
-        <w:t>{name}}</w:t>
-      </w:r>
-    </w:p>
-    <w:p>
-      <w:pPr>
-        <w:spacing w:after="0"/>
-        <w:ind w:right="367"/>
-        <w:rPr>
-          <w:lang w:val="en-US"/>
-        </w:rPr>
-      </w:pPr>
-      <w:proofErr w:type="gramStart"/>
-      <w:r>
-        <w:rPr>
-          <w:lang w:val="en-US"/>
-        </w:rPr>
-        <w:t>Contact:{</w:t>
-      </w:r>
-      <w:proofErr w:type="gramEnd"/>
-      <w:r>
-        <w:rPr>
-          <w:lang w:val="en-US"/>
-        </w:rPr>
-        <w:t>{contact}}</w:t>
-      </w:r>
-    </w:p>
-    <w:p>
-      <w:pPr>
-        <w:spacing w:after="0"/>
-        <w:ind w:right="367"/>
-        <w:rPr>
-          <w:lang w:val="en-US"/>
-        </w:rPr>
-      </w:pPr>
-      <w:r>
-        <w:rPr>
-          <w:lang w:val="en-US"/>
-        </w:rPr>
-        <w:t>Scan for website</w:t>
-      </w:r>
-      <w:bookmarkStart w:id="0" w:name="_GoBack"/>
-      <w:bookmarkEnd w:id="0"/>
-    </w:p>
-    <w:tbl>
-      <w:tblPr>
-        <w:tblStyle w:val="TableGrid"/>
-        <w:tblW w:w="0" w:type="auto"/>
-        <w:tblInd w:w="-5" w:type="dxa"/>
-        <w:tblLayout w:type="fixed"/>
-        <w:tblLook w:val="04A0" w:firstRow="1" w:lastRow="0" w:firstColumn="1" w:lastColumn="0" w:noHBand="0" w:noVBand="1"/>
-      </w:tblPr>
-      <w:tblGrid>
-        <w:gridCol w:w="540"/>
-        <w:gridCol w:w="177"/>
-        <w:gridCol w:w="1263"/>
-        <w:gridCol w:w="616"/>
-        <w:gridCol w:w="971"/>
-      </w:tblGrid>
-      <w:tr>
-        <w:trPr>
-          <w:trHeight w:val="248"/>
-        </w:trPr>
-        <w:tc>
-          <w:tcPr>
-            <w:tcW w:w="717" w:type="dxa"/>
-            <w:gridSpan w:val="2"/>
-            <w:shd w:val="clear" w:color="auto" w:fill="000000" w:themeFill="text1"/>
-          </w:tcPr>
-          <w:p>
-            <w:pPr>
-              <w:ind w:left="-90"/>
-              <w:rPr>
-                <w:color w:val="FFFFFF" w:themeColor="background1"/>
-                <w:lang w:val="en-US"/>
-              </w:rPr>
-            </w:pPr>
-            <w:r>
-              <w:rPr>
-                <w:color w:val="FFFFFF" w:themeColor="background1"/>
-                <w:lang w:val="en-US"/>
-              </w:rPr>
-              <w:t>Qty</w:t>
-            </w:r>
-          </w:p>
-        </w:tc>
-        <w:tc>
-          <w:tcPr>
-            <w:tcW w:w="1263" w:type="dxa"/>
-            <w:shd w:val="clear" w:color="auto" w:fill="000000" w:themeFill="text1"/>
-          </w:tcPr>
-          <w:p>
-            <w:pPr>
-              <w:ind w:left="-90"/>
-              <w:rPr>
-                <w:color w:val="FFFFFF" w:themeColor="background1"/>
-                <w:lang w:val="en-US"/>
-              </w:rPr>
-            </w:pPr>
-            <w:r>
-              <w:rPr>
-                <w:color w:val="FFFFFF" w:themeColor="background1"/>
-                <w:lang w:val="en-US"/>
-              </w:rPr>
-              <w:t>Description</w:t>
-            </w:r>
-          </w:p>
-        </w:tc>
-        <w:tc>
-          <w:tcPr>
-            <w:tcW w:w="616" w:type="dxa"/>
-            <w:shd w:val="clear" w:color="auto" w:fill="000000" w:themeFill="text1"/>
-          </w:tcPr>
-          <w:p>
-            <w:pPr>
-              <w:ind w:left="-90"/>
-              <w:rPr>
-                <w:color w:val="FFFFFF" w:themeColor="background1"/>
-                <w:lang w:val="en-US"/>
-              </w:rPr>
-            </w:pPr>
-            <w:r>
-              <w:rPr>
-                <w:color w:val="FFFFFF" w:themeColor="background1"/>
-                <w:lang w:val="en-US"/>
-              </w:rPr>
-              <w:t>Rate</w:t>
-            </w:r>
-          </w:p>
-        </w:tc>
-        <w:tc>
-          <w:tcPr>
-            <w:tcW w:w="971" w:type="dxa"/>
-            <w:shd w:val="clear" w:color="auto" w:fill="000000" w:themeFill="text1"/>
-          </w:tcPr>
-          <w:p>
-            <w:pPr>
-              <w:ind w:left="-90" w:right="62"/>
-              <w:rPr>
-                <w:color w:val="FFFFFF" w:themeColor="background1"/>
-                <w:lang w:val="en-US"/>
-              </w:rPr>
-            </w:pPr>
-            <w:r>
-              <w:rPr>
-                <w:color w:val="FFFFFF" w:themeColor="background1"/>
-                <w:lang w:val="en-US"/>
-              </w:rPr>
-              <w:t>Amount</w:t>
-            </w:r>
-          </w:p>
-        </w:tc>
-      </w:tr>
-      <w:tr>
-        <w:trPr>
-          <w:trHeight w:val="681"/>
-        </w:trPr>
-        <w:tc>
-          <w:tcPr>
-            <w:tcW w:w="540" w:type="dxa"/>
-          </w:tcPr>
-          <w:p>
-            <w:pPr>
-              <w:rPr>
-                <w:lang w:val="en-US"/>
-              </w:rPr>
-            </w:pPr>
-            <w:r>
-              <w:rPr>
-                <w:lang w:val="en-US"/>
-              </w:rPr>
-              <w:t>{{qt}}</w:t>
-            </w:r>
-          </w:p>
-        </w:tc>
-        <w:tc>
-          <w:tcPr>
-            <w:tcW w:w="1440" w:type="dxa"/>
-            <w:gridSpan w:val="2"/>
-          </w:tcPr>
-          <w:p>
-            <w:pPr>
-              <w:ind w:left="-90"/>
-              <w:rPr>
-                <w:lang w:val="en-US"/>
-              </w:rPr>
-            </w:pPr>
-            <w:r>
-              <w:rPr>
-                <w:lang w:val="en-US"/>
-              </w:rPr>
-              <w:t>{{description}}</w:t>
-            </w:r>
-          </w:p>
-        </w:tc>
-        <w:tc>
-          <w:tcPr>
-            <w:tcW w:w="616" w:type="dxa"/>
-          </w:tcPr>
-          <w:p>
-            <w:pPr>
-              <w:ind w:left="-90"/>
-              <w:rPr>
-                <w:lang w:val="en-US"/>
-              </w:rPr>
-            </w:pPr>
-            <w:r>
-              <w:rPr>
-                <w:lang w:val="en-US"/>
-              </w:rPr>
-              <w:t>{{r}}</w:t>
-            </w:r>
-          </w:p>
-        </w:tc>
-        <w:tc>
-          <w:tcPr>
-            <w:tcW w:w="971" w:type="dxa"/>
-          </w:tcPr>
-          <w:p>
-            <w:pPr>
-              <w:ind w:left="-90"/>
-              <w:rPr>
-                <w:lang w:val="en-US"/>
-              </w:rPr>
-            </w:pPr>
-            <w:r>
-              <w:rPr>
-                <w:lang w:val="en-US"/>
-              </w:rPr>
-              <w:t>{{amt}}</w:t>
-            </w:r>
-          </w:p>
-        </w:tc>
-      </w:tr>
-      <w:tr>
-        <w:trPr>
-          <w:trHeight w:val="248"/>
-        </w:trPr>
-        <w:tc>
-          <w:tcPr>
-            <w:tcW w:w="2596" w:type="dxa"/>
-            <w:gridSpan w:val="4"/>
-          </w:tcPr>
-          <w:p>
-            <w:pPr>
-              <w:ind w:left="-90"/>
-              <w:rPr>
-                <w:lang w:val="en-US"/>
-              </w:rPr>
-            </w:pPr>
-            <w:r>
-              <w:rPr>
-                <w:lang w:val="en-US"/>
-              </w:rPr>
-              <w:t>Total Amount</w:t>
-            </w:r>
-          </w:p>
-        </w:tc>
-        <w:tc>
-          <w:tcPr>
-            <w:tcW w:w="971" w:type="dxa"/>
-          </w:tcPr>
-          <w:p>
-            <w:pPr>
-              <w:ind w:left="-90"/>
-              <w:rPr>
-                <w:lang w:val="en-US"/>
-              </w:rPr>
-            </w:pPr>
-            <w:r>
-              <w:rPr>
-                <w:lang w:val="en-US"/>
-              </w:rPr>
-              <w:t>{{</w:t>
-            </w:r>
-            <w:proofErr w:type="spellStart"/>
-            <w:r>
-              <w:rPr>
-                <w:lang w:val="en-US"/>
-              </w:rPr>
-              <w:t>t_amt</w:t>
-            </w:r>
-            <w:proofErr w:type="spellEnd"/>
-            <w:r>
-              <w:rPr>
-                <w:lang w:val="en-US"/>
-              </w:rPr>
-              <w:t>}}</w:t>
-            </w:r>
-          </w:p>
-        </w:tc>
-      </w:tr>
-      <w:tr>
-        <w:trPr>
-          <w:trHeight w:val="248"/>
-        </w:trPr>
-        <w:tc>
-          <w:tcPr>
-            <w:tcW w:w="2596" w:type="dxa"/>
-            <w:gridSpan w:val="4"/>
-          </w:tcPr>
-          <w:p>
-            <w:pPr>
-              <w:ind w:left="-90"/>
-              <w:rPr>
-                <w:lang w:val="en-US"/>
-              </w:rPr>
-            </w:pPr>
-            <w:r>
-              <w:rPr>
-                <w:lang w:val="en-US"/>
-              </w:rPr>
-              <w:t>Discount</w:t>
-            </w:r>
-          </w:p>
-        </w:tc>
-        <w:tc>
-          <w:tcPr>
-            <w:tcW w:w="971" w:type="dxa"/>
-          </w:tcPr>
-          <w:p>
-            <w:pPr>
-              <w:ind w:left="-90"/>
-              <w:rPr>
-                <w:lang w:val="en-US"/>
-              </w:rPr>
-            </w:pPr>
-            <w:r>
-              <w:rPr>
-                <w:lang w:val="en-US"/>
-              </w:rPr>
-              <w:t>{{</w:t>
-            </w:r>
-            <w:proofErr w:type="spellStart"/>
-            <w:r>
-              <w:rPr>
-                <w:lang w:val="en-US"/>
-              </w:rPr>
-              <w:t>d_amt</w:t>
-            </w:r>
-            <w:proofErr w:type="spellEnd"/>
-            <w:r>
-              <w:rPr>
-                <w:lang w:val="en-US"/>
-              </w:rPr>
-              <w:t>}}</w:t>
-            </w:r>
-          </w:p>
-        </w:tc>
-      </w:tr>
-      <w:tr>
-        <w:trPr>
-          <w:trHeight w:val="248"/>
-        </w:trPr>
-        <w:tc>
-          <w:tcPr>
-            <w:tcW w:w="2596" w:type="dxa"/>
-            <w:gridSpan w:val="4"/>
-          </w:tcPr>
-          <w:p>
-            <w:pPr>
-              <w:ind w:left="-90"/>
-              <w:rPr>
-                <w:lang w:val="en-US"/>
-              </w:rPr>
-            </w:pPr>
-            <w:r>
-              <w:rPr>
-                <w:lang w:val="en-US"/>
-              </w:rPr>
-              <w:t>Balance</w:t>
-            </w:r>
-          </w:p>
-        </w:tc>
-        <w:tc>
-          <w:tcPr>
-            <w:tcW w:w="971" w:type="dxa"/>
-          </w:tcPr>
-          <w:p>
-            <w:pPr>
-              <w:ind w:left="-90"/>
-              <w:rPr>
-                <w:lang w:val="en-US"/>
-              </w:rPr>
-            </w:pPr>
-            <w:r>
-              <w:rPr>
-                <w:lang w:val="en-US"/>
-              </w:rPr>
-              <w:t>{{</w:t>
-            </w:r>
-            <w:proofErr w:type="spellStart"/>
-            <w:r>
-              <w:rPr>
-                <w:lang w:val="en-US"/>
-              </w:rPr>
-              <w:t>b_amt</w:t>
-            </w:r>
-            <w:proofErr w:type="spellEnd"/>
-            <w:r>
-              <w:rPr>
-                <w:lang w:val="en-US"/>
-              </w:rPr>
-              <w:t>}}</w:t>
-            </w:r>
-          </w:p>
-        </w:tc>
-      </w:tr>
-    </w:tbl>
-    <w:p>
-      <w:pPr>
-        <w:spacing w:after="0"/>
-        <w:ind w:left="-90" w:right="9"/>
-        <w:jc w:val="center"/>
-        <w:rPr>
-          <w:lang w:val="en-US"/>
-        </w:rPr>
-      </w:pPr>
-      <w:r>
-        <w:rPr>
-          <w:noProof/>
-          <w:lang w:val="en-US"/>
-        </w:rPr>
-        <mc:AlternateContent>
-          <mc:Choice Requires="wps">
-            <w:drawing>
-              <wp:anchor distT="0" distB="0" distL="114300" distR="114300" simplePos="0" relativeHeight="251660288" behindDoc="0" locked="0" layoutInCell="1" allowOverlap="1">
-                <wp:simplePos x="0" y="0"/>
-                <wp:positionH relativeFrom="margin">
-                  <wp:posOffset>112742</wp:posOffset>
-                </wp:positionH>
-                <wp:positionV relativeFrom="paragraph">
-                  <wp:posOffset>172792</wp:posOffset>
-                </wp:positionV>
-                <wp:extent cx="2009955" cy="249382"/>
-                <wp:effectExtent l="0" t="0" r="28575" b="17780"/>
-                <wp:wrapNone/>
-                <wp:docPr id="2" name="Rectangle 2"/>
-                <wp:cNvGraphicFramePr/>
-                <a:graphic xmlns:a="http://schemas.openxmlformats.org/drawingml/2006/main">
-                  <a:graphicData uri="http://schemas.microsoft.com/office/word/2010/wordprocessingShape">
-                    <wps:wsp>
-                      <wps:cNvSpPr/>
-                      <wps:spPr>
-                        <a:xfrm>
-                          <a:off x="0" y="0"/>
-                          <a:ext cx="2009955" cy="249382"/>
-                        </a:xfrm>
-                        <a:prstGeom prst="rect">
-                          <a:avLst/>
-                        </a:prstGeom>
-                      </wps:spPr>
-                      <wps:style>
-                        <a:lnRef idx="2">
-                          <a:schemeClr val="accent6"/>
-                        </a:lnRef>
-                        <a:fillRef idx="1">
-                          <a:schemeClr val="lt1"/>
-                        </a:fillRef>
-                        <a:effectRef idx="0">
-                          <a:schemeClr val="accent6"/>
-                        </a:effectRef>
-                        <a:fontRef idx="minor">
-                          <a:schemeClr val="dk1"/>
-                        </a:fontRef>
-                      </wps:style>
-                      <wps:txbx>
-                        <w:txbxContent>
-                          <w:p>
-                            <w:pPr>
-                              <w:spacing w:after="0"/>
-                              <w:ind w:right="226"/>
-                              <w:jc w:val="center"/>
-                              <w:rPr>
-                                <w:b/>
-                                <w:bCs/>
-                                <w:i/>
-                                <w:iCs/>
-                                <w:lang w:val="en-US"/>
-                              </w:rPr>
-                            </w:pPr>
-                            <w:r>
-                              <w:rPr>
-                                <w:b/>
-                                <w:bCs/>
-                                <w:i/>
-                                <w:iCs/>
-                                <w:lang w:val="en-US"/>
-                              </w:rPr>
-                              <w:t>***   THANK YOU   ***</w:t>
-                            </w:r>
-                          </w:p>
-                          <w:p>
-                            <w:pPr>
-                              <w:spacing w:after="0"/>
-                              <w:ind w:right="226"/>
-                              <w:jc w:val="center"/>
-                              <w:rPr>
-                                <w:b/>
-                                <w:bCs/>
-                                <w:u w:val="single"/>
-                                <w:lang w:val="en-US"/>
-                              </w:rPr>
-                            </w:pPr>
-                          </w:p>
-                          <w:p>
-                            <w:pPr>
-                              <w:jc w:val="center"/>
-                            </w:pPr>
-                          </w:p>
-                        </w:txbxContent>
-                      </wps:txbx>
-                      <wps:bodyPr rot="0" spcFirstLastPara="0" vertOverflow="overflow" horzOverflow="overflow" vert="horz" wrap="square" lIns="91440" tIns="45720" rIns="91440" bIns="45720" numCol="1" spcCol="0" rtlCol="0" fromWordArt="0" anchor="ctr" anchorCtr="0" forceAA="0" compatLnSpc="1">
-                        <a:prstTxWarp prst="textNoShape">
-                          <a:avLst/>
-                        </a:prstTxWarp>
-                        <a:noAutofit/>
-                      </wps:bodyPr>
-                    </wps:wsp>
-                  </a:graphicData>
-                </a:graphic>
-                <wp14:sizeRelH relativeFrom="margin">
-                  <wp14:pctWidth>0</wp14:pctWidth>
-                </wp14:sizeRelH>
-              </wp:anchor>
-            </w:drawing>
-          </mc:Choice>
-          <mc:Fallback>
-            <w:pict>
-              <v:rect id="Rectangle 2" o:spid="_x0000_s1028" style="position:absolute;left:0;text-align:left;margin-left:8.9pt;margin-top:13.6pt;width:158.25pt;height:19.65pt;z-index:251660288;visibility:visible;mso-wrap-style:square;mso-width-percent:0;mso-wrap-distance-left:9pt;mso-wrap-distance-top:0;mso-wrap-distance-right:9pt;mso-wrap-distance-bottom:0;mso-position-horizontal:absolute;mso-position-horizontal-relative:margin;mso-position-vertical:absolute;mso-position-vertical-relative:text;mso-width-percent:0;mso-width-relative:margin;v-text-anchor:middle" o:gfxdata="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" fillcolor="white [3201]" strokecolor="#70ad47 [3209]" strokeweight="1pt">
-                <v:textbox>
-                  <w:txbxContent>
                     <w:p>
                       <w:pPr>
                         <w:spacing w:after="0"/>
-                        <w:ind w:right="226"/>
-                        <w:jc w:val="center"/>
-                        <w:rPr>
-                          <w:b/>
-                          <w:bCs/>
-                          <w:i/>
-                          <w:iCs/>
-                          <w:lang w:val="en-US"/>
-                        </w:rPr>
-                      </w:pPr>
-                      <w:r>
-                        <w:rPr>
-                          <w:b/>
-                          <w:bCs/>
-                          <w:i/>
-                          <w:iCs/>
-                          <w:lang w:val="en-US"/>
-                        </w:rPr>
-                        <w:t>***   THANK YOU   ***</w:t>
-                      </w:r>
-                    </w:p>
-                    <w:p>
-                      <w:pPr>
-                        <w:spacing w:after="0"/>
-                        <w:ind w:right="226"/>
                         <w:jc w:val="center"/>
                         <w:rPr>
                           <w:b/>
@@ -1138,6 +1099,7 @@
                     </w:p>
                     <w:p>
                       <w:pPr>
+                        <w:spacing w:after="0"/>
                         <w:jc w:val="center"/>
                       </w:pPr>
                     </w:p>
@@ -1217,7 +1179,7 @@
         <v:path o:extrusionok="f" gradientshapeok="t" o:connecttype="rect"/>
         <o:lock v:ext="edit" aspectratio="t"/>
       </v:shapetype>
-      <v:shape id="_x0000_i1027" type="#_x0000_t75" style="width:10.5pt;height:10.5pt" o:bullet="t">
+      <v:shape id="_x0000_i1042" type="#_x0000_t75" style="width:10.65pt;height:10.65pt" o:bullet="t">
         <v:imagedata r:id="rId1" o:title="msoAEB3"/>
       </v:shape>
     </w:pict>
@@ -2929,7 +2891,7 @@
 </file>
 
 <file path=customXml/itemProps1.xml><?xml version="1.0" encoding="utf-8"?>
-<ds:datastoreItem xmlns:ds="http://schemas.openxmlformats.org/officeDocument/2006/customXml" ds:itemID="{A2A567A6-59F1-4112-8AC7-F9AB34A4D7E3}">
+<ds:datastoreItem xmlns:ds="http://schemas.openxmlformats.org/officeDocument/2006/customXml" ds:itemID="{79DD94B2-44F5-4619-A8A2-974A35294286}">
   <ds:schemaRefs>
     <ds:schemaRef ds:uri="http://schemas.openxmlformats.org/officeDocument/2006/bibliography"/>
   </ds:schemaRefs>

</xml_diff>